<commit_message>
fix: compact P11 first-day page and capture exact native Word pass
</commit_message>
<xml_diff>
--- a/tools/candidates/portfolio-owner-pdf-20261013/13-raschet-metrami/56-pervyy-den-do-podpisi.docx
+++ b/tools/candidates/portfolio-owner-pdf-20261013/13-raschet-metrami/56-pervyy-den-do-podpisi.docx
@@ -4,101 +4,215 @@
   <w:body>
     <w:p>
       <w:pPr>
-        <w:pStyle w:val="Title"/>
+        <w:spacing w:before="0" w:after="60" w:line="252" w:lineRule="auto"/>
+        <w:pBdr>
+          <w:bottom w:val="single" w:sz="9" w:space="3" w:color="977A48"/>
+        </w:pBdr>
       </w:pPr>
       <w:r>
+        <w:rPr>
+          <w:rFonts w:ascii="Arial" w:hAnsi="Arial"/>
+          <w:b/>
+          <w:color w:val="303438"/>
+          <w:sz w:val="32"/>
+        </w:rPr>
         <w:t>Первый день до подписания</w:t>
       </w:r>
     </w:p>
     <w:p>
+      <w:pPr>
+        <w:spacing w:before="0" w:after="60" w:line="252" w:lineRule="auto"/>
+      </w:pPr>
       <w:r>
+        <w:rPr>
+          <w:rFonts w:ascii="Arial" w:hAnsi="Arial"/>
+          <w:color w:val="303438"/>
+          <w:sz w:val="18"/>
+        </w:rPr>
         <w:t>Расчёт за работы квартирами или уступкой прав: зафиксировать предложение, направить запросы, сохранить доказательства и отложить решение до проверки.</w:t>
       </w:r>
     </w:p>
     <w:p>
       <w:pPr>
         <w:pStyle w:val="Heading1"/>
+        <w:spacing w:before="100" w:after="40" w:line="252" w:lineRule="auto"/>
       </w:pPr>
       <w:r>
+        <w:rPr>
+          <w:rFonts w:ascii="Arial" w:hAnsi="Arial"/>
+          <w:b/>
+          <w:color w:val="303438"/>
+          <w:sz w:val="20"/>
+        </w:rPr>
         <w:t>1. Запишите предложение</w:t>
       </w:r>
     </w:p>
     <w:p>
+      <w:pPr>
+        <w:spacing w:before="0" w:after="60" w:line="252" w:lineRule="auto"/>
+      </w:pPr>
       <w:r>
+        <w:rPr>
+          <w:rFonts w:ascii="Arial" w:hAnsi="Arial"/>
+          <w:color w:val="303438"/>
+          <w:sz w:val="18"/>
+        </w:rPr>
         <w:t>Форма сделки, номер и дата ДДУ, объект, цедент и застройщик, цена метра, доля работ, дисконт. Уточните регистрацию ДДУ и стадию передачи объекта.</w:t>
       </w:r>
     </w:p>
     <w:p>
       <w:pPr>
         <w:pStyle w:val="Heading1"/>
+        <w:spacing w:before="100" w:after="40" w:line="252" w:lineRule="auto"/>
       </w:pPr>
       <w:r>
+        <w:rPr>
+          <w:rFonts w:ascii="Arial" w:hAnsi="Arial"/>
+          <w:b/>
+          <w:color w:val="303438"/>
+          <w:sz w:val="20"/>
+        </w:rPr>
         <w:t>2. Зафиксируйте условия уступки</w:t>
       </w:r>
     </w:p>
     <w:p>
+      <w:pPr>
+        <w:spacing w:before="0" w:after="60" w:line="252" w:lineRule="auto"/>
+      </w:pPr>
       <w:r>
+        <w:rPr>
+          <w:rFonts w:ascii="Arial" w:hAnsi="Arial"/>
+          <w:color w:val="303438"/>
+          <w:sz w:val="18"/>
+        </w:rPr>
         <w:t>Выпишите дословно пункт об эскроу, цене уступки и переводе долга. Сохраните редакцию и номер пункта. При подписанном передаточном акте либо неподтверждённой стадии — СТОП до определения формы сделки.</w:t>
       </w:r>
     </w:p>
     <w:p>
       <w:pPr>
         <w:pStyle w:val="Heading1"/>
+        <w:spacing w:before="100" w:after="40" w:line="252" w:lineRule="auto"/>
       </w:pPr>
       <w:r>
+        <w:rPr>
+          <w:rFonts w:ascii="Arial" w:hAnsi="Arial"/>
+          <w:b/>
+          <w:color w:val="303438"/>
+          <w:sz w:val="20"/>
+        </w:rPr>
         <w:t>3. Направьте два запроса</w:t>
       </w:r>
     </w:p>
     <w:p>
+      <w:pPr>
+        <w:spacing w:before="0" w:after="60" w:line="252" w:lineRule="auto"/>
+      </w:pPr>
       <w:r>
+        <w:rPr>
+          <w:rFonts w:ascii="Arial" w:hAnsi="Arial"/>
+          <w:color w:val="303438"/>
+          <w:sz w:val="18"/>
+        </w:rPr>
         <w:t>По словарю 50 заполните 54-zapros-sostoyanie-escrow.docx об эскроу и 53-zapros-status-obekta.docx о статусе объекта. Запросите банковское подтверждение поступления денег, сведения о ДДУ, разрешениях, вводе и передаче. Укажите срок и адрес ответа.</w:t>
       </w:r>
     </w:p>
     <w:p>
       <w:pPr>
         <w:pStyle w:val="Heading1"/>
+        <w:spacing w:before="100" w:after="40" w:line="252" w:lineRule="auto"/>
       </w:pPr>
       <w:r>
+        <w:rPr>
+          <w:rFonts w:ascii="Arial" w:hAnsi="Arial"/>
+          <w:b/>
+          <w:color w:val="303438"/>
+          <w:sz w:val="20"/>
+        </w:rPr>
         <w:t>4. Подтвердите отправку</w:t>
       </w:r>
     </w:p>
     <w:p>
+      <w:pPr>
+        <w:spacing w:before="0" w:after="60" w:line="252" w:lineRule="auto"/>
+      </w:pPr>
       <w:r>
+        <w:rPr>
+          <w:rFonts w:ascii="Arial" w:hAnsi="Arial"/>
+          <w:color w:val="303438"/>
+          <w:sz w:val="18"/>
+        </w:rPr>
         <w:t>Удалите незаполненные поля, зарегистрируйте исходящие номера, сохраните письма, приложения, квитанции и доказательства вручения. Молчание не подтверждает оплату эскроу.</w:t>
       </w:r>
     </w:p>
     <w:p>
       <w:pPr>
         <w:pStyle w:val="Heading1"/>
+        <w:spacing w:before="100" w:after="40" w:line="252" w:lineRule="auto"/>
       </w:pPr>
       <w:r>
+        <w:rPr>
+          <w:rFonts w:ascii="Arial" w:hAnsi="Arial"/>
+          <w:b/>
+          <w:color w:val="303438"/>
+          <w:sz w:val="20"/>
+        </w:rPr>
         <w:t>5. Ответьте на требование подписать сегодня</w:t>
       </w:r>
     </w:p>
     <w:p>
+      <w:pPr>
+        <w:spacing w:before="0" w:after="60" w:line="252" w:lineRule="auto"/>
+      </w:pPr>
       <w:r>
+        <w:rPr>
+          <w:rFonts w:ascii="Arial" w:hAnsi="Arial"/>
+          <w:color w:val="303438"/>
+          <w:sz w:val="18"/>
+        </w:rPr>
         <w:t>Заинтересованы в сделке, но подписываем после проверки документов банка, стадии передачи и условий уступки. Работы в счёт недвижимости до оформления проверенной формы расчёта не начинаем.</w:t>
       </w:r>
     </w:p>
     <w:p>
       <w:pPr>
         <w:pStyle w:val="Heading1"/>
+        <w:spacing w:before="100" w:after="40" w:line="252" w:lineRule="auto"/>
       </w:pPr>
       <w:r>
+        <w:rPr>
+          <w:rFonts w:ascii="Arial" w:hAnsi="Arial"/>
+          <w:b/>
+          <w:color w:val="303438"/>
+          <w:sz w:val="20"/>
+        </w:rPr>
         <w:t>6. Перейдите к проверке сделки</w:t>
       </w:r>
     </w:p>
     <w:p>
+      <w:pPr>
+        <w:spacing w:before="0" w:after="60" w:line="252" w:lineRule="auto"/>
+      </w:pPr>
       <w:r>
+        <w:rPr>
+          <w:rFonts w:ascii="Arial" w:hAnsi="Arial"/>
+          <w:color w:val="303438"/>
+          <w:sz w:val="18"/>
+        </w:rPr>
         <w:t>Откройте алгоритм 51, заполните чек-лист 52, используйте памятку 55. Два и более красных флага — СТОП до документальной проверки, мер защиты, письменного решения руководителя и устранения правовых препятствий.</w:t>
       </w:r>
     </w:p>
     <w:p>
       <w:pPr>
         <w:pStyle w:val="Heading1"/>
-        <w:pageBreakBefore/>
+        <w:pageBreakBefore w:val="0"/>
+        <w:spacing w:before="100" w:after="40" w:line="252" w:lineRule="auto"/>
       </w:pPr>
       <w:r>
+        <w:rPr>
+          <w:rFonts w:ascii="Arial" w:hAnsi="Arial"/>
+          <w:b/>
+          <w:color w:val="303438"/>
+          <w:sz w:val="20"/>
+        </w:rPr>
         <w:t>Ответы на давление контрагента</w:t>
       </w:r>
     </w:p>
@@ -119,6 +233,11 @@
           </w:tcPr>
           <w:p>
             <w:r>
+              <w:rPr>
+                <w:rFonts w:ascii="Arial" w:hAnsi="Arial"/>
+                <w:color w:val="303438"/>
+                <w:sz w:val="16"/>
+              </w:rPr>
               <w:t>Предложение</w:t>
             </w:r>
           </w:p>
@@ -129,6 +248,11 @@
           </w:tcPr>
           <w:p>
             <w:r>
+              <w:rPr>
+                <w:rFonts w:ascii="Arial" w:hAnsi="Arial"/>
+                <w:color w:val="303438"/>
+                <w:sz w:val="16"/>
+              </w:rPr>
               <w:t>Ответ</w:t>
             </w:r>
           </w:p>
@@ -141,6 +265,11 @@
           </w:tcPr>
           <w:p>
             <w:r>
+              <w:rPr>
+                <w:rFonts w:ascii="Arial" w:hAnsi="Arial"/>
+                <w:color w:val="303438"/>
+                <w:sz w:val="16"/>
+              </w:rPr>
               <w:t>Подписываем сегодня, иначе квартира уйдёт</w:t>
             </w:r>
           </w:p>
@@ -151,6 +280,11 @@
           </w:tcPr>
           <w:p>
             <w:r>
+              <w:rPr>
+                <w:rFonts w:ascii="Arial" w:hAnsi="Arial"/>
+                <w:color w:val="303438"/>
+                <w:sz w:val="16"/>
+              </w:rPr>
               <w:t>Заинтересованы, вернёмся после подтверждения оплаты ДДУ, стадии передачи и условий уступки.</w:t>
             </w:r>
           </w:p>
@@ -163,6 +297,11 @@
           </w:tcPr>
           <w:p>
             <w:r>
+              <w:rPr>
+                <w:rFonts w:ascii="Arial" w:hAnsi="Arial"/>
+                <w:color w:val="303438"/>
+                <w:sz w:val="16"/>
+              </w:rPr>
               <w:t>Справку по эскроу дадим потом</w:t>
             </w:r>
           </w:p>
@@ -173,6 +312,11 @@
           </w:tcPr>
           <w:p>
             <w:r>
+              <w:rPr>
+                <w:rFonts w:ascii="Arial" w:hAnsi="Arial"/>
+                <w:color w:val="303438"/>
+                <w:sz w:val="16"/>
+              </w:rPr>
               <w:t>Запрос уже направлен. До банковского подтверждения оплату ДДУ не считаем проверенной.</w:t>
             </w:r>
           </w:p>
@@ -185,6 +329,11 @@
           </w:tcPr>
           <w:p>
             <w:r>
+              <w:rPr>
+                <w:rFonts w:ascii="Arial" w:hAnsi="Arial"/>
+                <w:color w:val="303438"/>
+                <w:sz w:val="16"/>
+              </w:rPr>
               <w:t>Начинайте работы, оформим позже</w:t>
             </w:r>
           </w:p>
@@ -195,6 +344,11 @@
           </w:tcPr>
           <w:p>
             <w:r>
+              <w:rPr>
+                <w:rFonts w:ascii="Arial" w:hAnsi="Arial"/>
+                <w:color w:val="303438"/>
+                <w:sz w:val="16"/>
+              </w:rPr>
               <w:t>Работы в счёт недвижимости начинаем после согласования документально подтверждённой формы расчёта.</w:t>
             </w:r>
           </w:p>
@@ -207,6 +361,11 @@
           </w:tcPr>
           <w:p>
             <w:r>
+              <w:rPr>
+                <w:rFonts w:ascii="Arial" w:hAnsi="Arial"/>
+                <w:color w:val="303438"/>
+                <w:sz w:val="16"/>
+              </w:rPr>
               <w:t>Скидка действует до конца недели</w:t>
             </w:r>
           </w:p>
@@ -217,6 +376,11 @@
           </w:tcPr>
           <w:p>
             <w:r>
+              <w:rPr>
+                <w:rFonts w:ascii="Arial" w:hAnsi="Arial"/>
+                <w:color w:val="303438"/>
+                <w:sz w:val="16"/>
+              </w:rPr>
               <w:t>Сначала оценим ликвидность, налоги, срок продажи и стоимость финансирования.</w:t>
             </w:r>
           </w:p>
@@ -225,7 +389,7 @@
     </w:tbl>
     <w:sectPr>
       <w:pgSz w:w="11906" w:h="16838"/>
-      <w:pgMar w:top="1020" w:right="1800" w:bottom="1020" w:left="1800" w:header="720" w:footer="720" w:gutter="0"/>
+      <w:pgMar w:top="765" w:right="1800" w:bottom="765" w:left="1800" w:header="720" w:footer="720" w:gutter="0"/>
       <w:cols w:space="720"/>
       <w:docGrid w:linePitch="360"/>
     </w:sectPr>

</xml_diff>